<commit_message>
Revisão e ultimas alterações
</commit_message>
<xml_diff>
--- a/docs/relatorio_formatado.docx
+++ b/docs/relatorio_formatado.docx
@@ -2324,7 +2324,7 @@
     </w:p>
     <w:sdt>
       <w:sdtPr>
-        <w:id w:val="-870791622"/>
+        <w:id w:val="906177266"/>
         <w:docPartObj>
           <w:docPartGallery w:val="Table of Contents"/>
           <w:docPartUnique w:val="1"/>
@@ -2335,7 +2335,7 @@
           <w:pPr>
             <w:widowControl w:val="0"/>
             <w:tabs>
-              <w:tab w:val="right" w:leader="none" w:pos="9406"/>
+              <w:tab w:val="right" w:leader="dot" w:pos="12000"/>
             </w:tabs>
             <w:spacing w:before="60" w:line="240" w:lineRule="auto"/>
             <w:rPr>
@@ -2361,24 +2361,9 @@
               </w:rPr>
               <w:t xml:space="preserve">1 Introdução e problema</w:t>
               <w:tab/>
+              <w:t xml:space="preserve">4</w:t>
             </w:r>
           </w:hyperlink>
-          <w:r>
-            <w:fldChar w:fldCharType="begin"/>
-            <w:instrText xml:space="preserve"> PAGEREF _heading= \h </w:instrText>
-            <w:fldChar w:fldCharType="separate"/>
-          </w:r>
-          <w:r>
-            <w:rPr>
-              <w:b w:val="1"/>
-              <w:bCs w:val="1"/>
-              <w:rtl w:val="0"/>
-            </w:rPr>
-            <w:t xml:space="preserve">4</w:t>
-          </w:r>
-          <w:r>
-            <w:fldChar w:fldCharType="end"/>
-          </w:r>
           <w:r>
             <w:rPr>
               <w:rtl w:val="0"/>
@@ -2389,7 +2374,7 @@
           <w:pPr>
             <w:widowControl w:val="0"/>
             <w:tabs>
-              <w:tab w:val="right" w:leader="none" w:pos="9406"/>
+              <w:tab w:val="right" w:leader="dot" w:pos="12000"/>
             </w:tabs>
             <w:spacing w:before="60" w:line="240" w:lineRule="auto"/>
             <w:rPr>
@@ -2410,24 +2395,9 @@
               </w:rPr>
               <w:t xml:space="preserve">2 Base de dados</w:t>
               <w:tab/>
+              <w:t xml:space="preserve">4</w:t>
             </w:r>
           </w:hyperlink>
-          <w:r>
-            <w:fldChar w:fldCharType="begin"/>
-            <w:instrText xml:space="preserve"> PAGEREF _heading= \h </w:instrText>
-            <w:fldChar w:fldCharType="separate"/>
-          </w:r>
-          <w:r>
-            <w:rPr>
-              <w:b w:val="1"/>
-              <w:bCs w:val="1"/>
-              <w:rtl w:val="0"/>
-            </w:rPr>
-            <w:t xml:space="preserve">4</w:t>
-          </w:r>
-          <w:r>
-            <w:fldChar w:fldCharType="end"/>
-          </w:r>
           <w:r>
             <w:rPr>
               <w:rtl w:val="0"/>
@@ -2438,7 +2408,7 @@
           <w:pPr>
             <w:widowControl w:val="0"/>
             <w:tabs>
-              <w:tab w:val="right" w:leader="none" w:pos="9406"/>
+              <w:tab w:val="right" w:leader="dot" w:pos="12000"/>
             </w:tabs>
             <w:spacing w:before="60" w:line="240" w:lineRule="auto"/>
             <w:ind w:left="360" w:firstLine="0"/>
@@ -2456,22 +2426,9 @@
               </w:rPr>
               <w:t xml:space="preserve">2.1 Origem e descrição</w:t>
               <w:tab/>
+              <w:t xml:space="preserve">4</w:t>
             </w:r>
           </w:hyperlink>
-          <w:r>
-            <w:fldChar w:fldCharType="begin"/>
-            <w:instrText xml:space="preserve"> PAGEREF _heading= \h </w:instrText>
-            <w:fldChar w:fldCharType="separate"/>
-          </w:r>
-          <w:r>
-            <w:rPr>
-              <w:rtl w:val="0"/>
-            </w:rPr>
-            <w:t xml:space="preserve">4</w:t>
-          </w:r>
-          <w:r>
-            <w:fldChar w:fldCharType="end"/>
-          </w:r>
           <w:r>
             <w:rPr>
               <w:rtl w:val="0"/>
@@ -2482,7 +2439,7 @@
           <w:pPr>
             <w:widowControl w:val="0"/>
             <w:tabs>
-              <w:tab w:val="right" w:leader="none" w:pos="9406"/>
+              <w:tab w:val="right" w:leader="dot" w:pos="12000"/>
             </w:tabs>
             <w:spacing w:before="60" w:line="240" w:lineRule="auto"/>
             <w:ind w:left="360" w:firstLine="0"/>
@@ -2500,22 +2457,9 @@
               </w:rPr>
               <w:t xml:space="preserve">2.2 Dicionário de atributos</w:t>
               <w:tab/>
+              <w:t xml:space="preserve">4</w:t>
             </w:r>
           </w:hyperlink>
-          <w:r>
-            <w:fldChar w:fldCharType="begin"/>
-            <w:instrText xml:space="preserve"> PAGEREF _heading= \h </w:instrText>
-            <w:fldChar w:fldCharType="separate"/>
-          </w:r>
-          <w:r>
-            <w:rPr>
-              <w:rtl w:val="0"/>
-            </w:rPr>
-            <w:t xml:space="preserve">4</w:t>
-          </w:r>
-          <w:r>
-            <w:fldChar w:fldCharType="end"/>
-          </w:r>
           <w:r>
             <w:rPr>
               <w:rtl w:val="0"/>
@@ -2526,7 +2470,7 @@
           <w:pPr>
             <w:widowControl w:val="0"/>
             <w:tabs>
-              <w:tab w:val="right" w:leader="none" w:pos="9406"/>
+              <w:tab w:val="right" w:leader="dot" w:pos="12000"/>
             </w:tabs>
             <w:spacing w:before="60" w:line="240" w:lineRule="auto"/>
             <w:ind w:left="360" w:firstLine="0"/>
@@ -2544,22 +2488,9 @@
               </w:rPr>
               <w:t xml:space="preserve">2.3 Distribuição e qualidade</w:t>
               <w:tab/>
+              <w:t xml:space="preserve">5</w:t>
             </w:r>
           </w:hyperlink>
-          <w:r>
-            <w:fldChar w:fldCharType="begin"/>
-            <w:instrText xml:space="preserve"> PAGEREF _heading= \h </w:instrText>
-            <w:fldChar w:fldCharType="separate"/>
-          </w:r>
-          <w:r>
-            <w:rPr>
-              <w:rtl w:val="0"/>
-            </w:rPr>
-            <w:t xml:space="preserve">5</w:t>
-          </w:r>
-          <w:r>
-            <w:fldChar w:fldCharType="end"/>
-          </w:r>
           <w:r>
             <w:rPr>
               <w:rtl w:val="0"/>
@@ -2570,7 +2501,7 @@
           <w:pPr>
             <w:widowControl w:val="0"/>
             <w:tabs>
-              <w:tab w:val="right" w:leader="none" w:pos="9406"/>
+              <w:tab w:val="right" w:leader="dot" w:pos="12000"/>
             </w:tabs>
             <w:spacing w:before="60" w:line="240" w:lineRule="auto"/>
             <w:ind w:left="360" w:firstLine="0"/>
@@ -2588,22 +2519,9 @@
               </w:rPr>
               <w:t xml:space="preserve">2.4 Estatísticas descritivas</w:t>
               <w:tab/>
+              <w:t xml:space="preserve">6</w:t>
             </w:r>
           </w:hyperlink>
-          <w:r>
-            <w:fldChar w:fldCharType="begin"/>
-            <w:instrText xml:space="preserve"> PAGEREF _heading= \h </w:instrText>
-            <w:fldChar w:fldCharType="separate"/>
-          </w:r>
-          <w:r>
-            <w:rPr>
-              <w:rtl w:val="0"/>
-            </w:rPr>
-            <w:t xml:space="preserve">5</w:t>
-          </w:r>
-          <w:r>
-            <w:fldChar w:fldCharType="end"/>
-          </w:r>
           <w:r>
             <w:rPr>
               <w:rtl w:val="0"/>
@@ -2614,7 +2532,7 @@
           <w:pPr>
             <w:widowControl w:val="0"/>
             <w:tabs>
-              <w:tab w:val="right" w:leader="none" w:pos="9406"/>
+              <w:tab w:val="right" w:leader="dot" w:pos="12000"/>
             </w:tabs>
             <w:spacing w:before="60" w:line="240" w:lineRule="auto"/>
             <w:rPr>
@@ -2635,24 +2553,9 @@
               </w:rPr>
               <w:t xml:space="preserve">3 Metodologia</w:t>
               <w:tab/>
+              <w:t xml:space="preserve">6</w:t>
             </w:r>
           </w:hyperlink>
-          <w:r>
-            <w:fldChar w:fldCharType="begin"/>
-            <w:instrText xml:space="preserve"> PAGEREF _heading= \h </w:instrText>
-            <w:fldChar w:fldCharType="separate"/>
-          </w:r>
-          <w:r>
-            <w:rPr>
-              <w:b w:val="1"/>
-              <w:bCs w:val="1"/>
-              <w:rtl w:val="0"/>
-            </w:rPr>
-            <w:t xml:space="preserve">6</w:t>
-          </w:r>
-          <w:r>
-            <w:fldChar w:fldCharType="end"/>
-          </w:r>
           <w:r>
             <w:rPr>
               <w:rtl w:val="0"/>
@@ -2663,7 +2566,7 @@
           <w:pPr>
             <w:widowControl w:val="0"/>
             <w:tabs>
-              <w:tab w:val="right" w:leader="none" w:pos="9406"/>
+              <w:tab w:val="right" w:leader="dot" w:pos="12000"/>
             </w:tabs>
             <w:spacing w:before="60" w:line="240" w:lineRule="auto"/>
             <w:ind w:left="360" w:firstLine="0"/>
@@ -2681,22 +2584,9 @@
               </w:rPr>
               <w:t xml:space="preserve">3.1 Fluxo de processamento (pipeline)</w:t>
               <w:tab/>
+              <w:t xml:space="preserve">6</w:t>
             </w:r>
           </w:hyperlink>
-          <w:r>
-            <w:fldChar w:fldCharType="begin"/>
-            <w:instrText xml:space="preserve"> PAGEREF _heading= \h </w:instrText>
-            <w:fldChar w:fldCharType="separate"/>
-          </w:r>
-          <w:r>
-            <w:rPr>
-              <w:rtl w:val="0"/>
-            </w:rPr>
-            <w:t xml:space="preserve">6</w:t>
-          </w:r>
-          <w:r>
-            <w:fldChar w:fldCharType="end"/>
-          </w:r>
           <w:r>
             <w:rPr>
               <w:rtl w:val="0"/>
@@ -2707,7 +2597,7 @@
           <w:pPr>
             <w:widowControl w:val="0"/>
             <w:tabs>
-              <w:tab w:val="right" w:leader="none" w:pos="9406"/>
+              <w:tab w:val="right" w:leader="dot" w:pos="12000"/>
             </w:tabs>
             <w:spacing w:before="60" w:line="240" w:lineRule="auto"/>
             <w:ind w:left="360" w:firstLine="0"/>
@@ -2725,22 +2615,9 @@
               </w:rPr>
               <w:t xml:space="preserve">3.2 Validação e seleção</w:t>
               <w:tab/>
+              <w:t xml:space="preserve">6</w:t>
             </w:r>
           </w:hyperlink>
-          <w:r>
-            <w:fldChar w:fldCharType="begin"/>
-            <w:instrText xml:space="preserve"> PAGEREF _heading= \h </w:instrText>
-            <w:fldChar w:fldCharType="separate"/>
-          </w:r>
-          <w:r>
-            <w:rPr>
-              <w:rtl w:val="0"/>
-            </w:rPr>
-            <w:t xml:space="preserve">6</w:t>
-          </w:r>
-          <w:r>
-            <w:fldChar w:fldCharType="end"/>
-          </w:r>
           <w:r>
             <w:rPr>
               <w:rtl w:val="0"/>
@@ -2751,7 +2628,7 @@
           <w:pPr>
             <w:widowControl w:val="0"/>
             <w:tabs>
-              <w:tab w:val="right" w:leader="none" w:pos="9406"/>
+              <w:tab w:val="right" w:leader="dot" w:pos="12000"/>
             </w:tabs>
             <w:spacing w:before="60" w:line="240" w:lineRule="auto"/>
             <w:ind w:left="360" w:firstLine="0"/>
@@ -2769,22 +2646,9 @@
               </w:rPr>
               <w:t xml:space="preserve">3.3 Fases do notebook</w:t>
               <w:tab/>
+              <w:t xml:space="preserve">7</w:t>
             </w:r>
           </w:hyperlink>
-          <w:r>
-            <w:fldChar w:fldCharType="begin"/>
-            <w:instrText xml:space="preserve"> PAGEREF _heading= \h </w:instrText>
-            <w:fldChar w:fldCharType="separate"/>
-          </w:r>
-          <w:r>
-            <w:rPr>
-              <w:rtl w:val="0"/>
-            </w:rPr>
-            <w:t xml:space="preserve">7</w:t>
-          </w:r>
-          <w:r>
-            <w:fldChar w:fldCharType="end"/>
-          </w:r>
           <w:r>
             <w:rPr>
               <w:rtl w:val="0"/>
@@ -2795,7 +2659,7 @@
           <w:pPr>
             <w:widowControl w:val="0"/>
             <w:tabs>
-              <w:tab w:val="right" w:leader="none" w:pos="9406"/>
+              <w:tab w:val="right" w:leader="dot" w:pos="12000"/>
             </w:tabs>
             <w:spacing w:before="60" w:line="240" w:lineRule="auto"/>
             <w:ind w:left="360" w:firstLine="0"/>
@@ -2813,22 +2677,9 @@
               </w:rPr>
               <w:t xml:space="preserve">3.4 Engenharia de atributos testada</w:t>
               <w:tab/>
+              <w:t xml:space="preserve">8</w:t>
             </w:r>
           </w:hyperlink>
-          <w:r>
-            <w:fldChar w:fldCharType="begin"/>
-            <w:instrText xml:space="preserve"> PAGEREF _heading= \h </w:instrText>
-            <w:fldChar w:fldCharType="separate"/>
-          </w:r>
-          <w:r>
-            <w:rPr>
-              <w:rtl w:val="0"/>
-            </w:rPr>
-            <w:t xml:space="preserve">7</w:t>
-          </w:r>
-          <w:r>
-            <w:fldChar w:fldCharType="end"/>
-          </w:r>
           <w:r>
             <w:rPr>
               <w:rtl w:val="0"/>
@@ -2839,7 +2690,7 @@
           <w:pPr>
             <w:widowControl w:val="0"/>
             <w:tabs>
-              <w:tab w:val="right" w:leader="none" w:pos="9406"/>
+              <w:tab w:val="right" w:leader="dot" w:pos="12000"/>
             </w:tabs>
             <w:spacing w:before="60" w:line="240" w:lineRule="auto"/>
             <w:rPr>
@@ -2860,24 +2711,9 @@
               </w:rPr>
               <w:t xml:space="preserve">4 Resultados</w:t>
               <w:tab/>
+              <w:t xml:space="preserve">8</w:t>
             </w:r>
           </w:hyperlink>
-          <w:r>
-            <w:fldChar w:fldCharType="begin"/>
-            <w:instrText xml:space="preserve"> PAGEREF _heading= \h </w:instrText>
-            <w:fldChar w:fldCharType="separate"/>
-          </w:r>
-          <w:r>
-            <w:rPr>
-              <w:b w:val="1"/>
-              <w:bCs w:val="1"/>
-              <w:rtl w:val="0"/>
-            </w:rPr>
-            <w:t xml:space="preserve">8</w:t>
-          </w:r>
-          <w:r>
-            <w:fldChar w:fldCharType="end"/>
-          </w:r>
           <w:r>
             <w:rPr>
               <w:rtl w:val="0"/>
@@ -2888,7 +2724,7 @@
           <w:pPr>
             <w:widowControl w:val="0"/>
             <w:tabs>
-              <w:tab w:val="right" w:leader="none" w:pos="9406"/>
+              <w:tab w:val="right" w:leader="dot" w:pos="12000"/>
             </w:tabs>
             <w:spacing w:before="60" w:line="240" w:lineRule="auto"/>
             <w:ind w:left="360" w:firstLine="0"/>
@@ -2906,22 +2742,9 @@
               </w:rPr>
               <w:t xml:space="preserve">4.1 Busca em grade e hiperparâmetros selecionados</w:t>
               <w:tab/>
+              <w:t xml:space="preserve">8</w:t>
             </w:r>
           </w:hyperlink>
-          <w:r>
-            <w:fldChar w:fldCharType="begin"/>
-            <w:instrText xml:space="preserve"> PAGEREF _heading= \h </w:instrText>
-            <w:fldChar w:fldCharType="separate"/>
-          </w:r>
-          <w:r>
-            <w:rPr>
-              <w:rtl w:val="0"/>
-            </w:rPr>
-            <w:t xml:space="preserve">8</w:t>
-          </w:r>
-          <w:r>
-            <w:fldChar w:fldCharType="end"/>
-          </w:r>
           <w:r>
             <w:rPr>
               <w:rtl w:val="0"/>
@@ -2932,7 +2755,7 @@
           <w:pPr>
             <w:widowControl w:val="0"/>
             <w:tabs>
-              <w:tab w:val="right" w:leader="none" w:pos="9406"/>
+              <w:tab w:val="right" w:leader="dot" w:pos="12000"/>
             </w:tabs>
             <w:spacing w:before="60" w:line="240" w:lineRule="auto"/>
             <w:ind w:left="360" w:firstLine="0"/>
@@ -2950,22 +2773,9 @@
               </w:rPr>
               <w:t xml:space="preserve">4.2 Comparação entre as codificações one-hot e ordinal</w:t>
               <w:tab/>
+              <w:t xml:space="preserve">8</w:t>
             </w:r>
           </w:hyperlink>
-          <w:r>
-            <w:fldChar w:fldCharType="begin"/>
-            <w:instrText xml:space="preserve"> PAGEREF _heading= \h </w:instrText>
-            <w:fldChar w:fldCharType="separate"/>
-          </w:r>
-          <w:r>
-            <w:rPr>
-              <w:rtl w:val="0"/>
-            </w:rPr>
-            <w:t xml:space="preserve">8</w:t>
-          </w:r>
-          <w:r>
-            <w:fldChar w:fldCharType="end"/>
-          </w:r>
           <w:r>
             <w:rPr>
               <w:rtl w:val="0"/>
@@ -2976,7 +2786,7 @@
           <w:pPr>
             <w:widowControl w:val="0"/>
             <w:tabs>
-              <w:tab w:val="right" w:leader="none" w:pos="9406"/>
+              <w:tab w:val="right" w:leader="dot" w:pos="12000"/>
             </w:tabs>
             <w:spacing w:before="60" w:line="240" w:lineRule="auto"/>
             <w:ind w:left="360" w:firstLine="0"/>
@@ -2994,22 +2804,9 @@
               </w:rPr>
               <w:t xml:space="preserve">4.3 Referência (baseline) da classe majoritária</w:t>
               <w:tab/>
+              <w:t xml:space="preserve">9</w:t>
             </w:r>
           </w:hyperlink>
-          <w:r>
-            <w:fldChar w:fldCharType="begin"/>
-            <w:instrText xml:space="preserve"> PAGEREF _heading= \h </w:instrText>
-            <w:fldChar w:fldCharType="separate"/>
-          </w:r>
-          <w:r>
-            <w:rPr>
-              <w:rtl w:val="0"/>
-            </w:rPr>
-            <w:t xml:space="preserve">9</w:t>
-          </w:r>
-          <w:r>
-            <w:fldChar w:fldCharType="end"/>
-          </w:r>
           <w:r>
             <w:rPr>
               <w:rtl w:val="0"/>
@@ -3020,7 +2817,7 @@
           <w:pPr>
             <w:widowControl w:val="0"/>
             <w:tabs>
-              <w:tab w:val="right" w:leader="none" w:pos="9406"/>
+              <w:tab w:val="right" w:leader="dot" w:pos="12000"/>
             </w:tabs>
             <w:spacing w:before="60" w:line="240" w:lineRule="auto"/>
             <w:ind w:left="360" w:firstLine="0"/>
@@ -3038,22 +2835,9 @@
               </w:rPr>
               <w:t xml:space="preserve">4.4 Ablação de atributos</w:t>
               <w:tab/>
+              <w:t xml:space="preserve">9</w:t>
             </w:r>
           </w:hyperlink>
-          <w:r>
-            <w:fldChar w:fldCharType="begin"/>
-            <w:instrText xml:space="preserve"> PAGEREF _heading= \h </w:instrText>
-            <w:fldChar w:fldCharType="separate"/>
-          </w:r>
-          <w:r>
-            <w:rPr>
-              <w:rtl w:val="0"/>
-            </w:rPr>
-            <w:t xml:space="preserve">9</w:t>
-          </w:r>
-          <w:r>
-            <w:fldChar w:fldCharType="end"/>
-          </w:r>
           <w:r>
             <w:rPr>
               <w:rtl w:val="0"/>
@@ -3064,7 +2848,7 @@
           <w:pPr>
             <w:widowControl w:val="0"/>
             <w:tabs>
-              <w:tab w:val="right" w:leader="none" w:pos="9406"/>
+              <w:tab w:val="right" w:leader="dot" w:pos="12000"/>
             </w:tabs>
             <w:spacing w:before="60" w:line="240" w:lineRule="auto"/>
             <w:ind w:left="360" w:firstLine="0"/>
@@ -3082,22 +2866,9 @@
               </w:rPr>
               <w:t xml:space="preserve">4.5 Engenharia de atributos (razões e interações clínicas)</w:t>
               <w:tab/>
+              <w:t xml:space="preserve">10</w:t>
             </w:r>
           </w:hyperlink>
-          <w:r>
-            <w:fldChar w:fldCharType="begin"/>
-            <w:instrText xml:space="preserve"> PAGEREF _heading= \h </w:instrText>
-            <w:fldChar w:fldCharType="separate"/>
-          </w:r>
-          <w:r>
-            <w:rPr>
-              <w:rtl w:val="0"/>
-            </w:rPr>
-            <w:t xml:space="preserve">10</w:t>
-          </w:r>
-          <w:r>
-            <w:fldChar w:fldCharType="end"/>
-          </w:r>
           <w:r>
             <w:rPr>
               <w:rtl w:val="0"/>
@@ -3108,7 +2879,7 @@
           <w:pPr>
             <w:widowControl w:val="0"/>
             <w:tabs>
-              <w:tab w:val="right" w:leader="none" w:pos="9406"/>
+              <w:tab w:val="right" w:leader="dot" w:pos="12000"/>
             </w:tabs>
             <w:spacing w:before="60" w:line="240" w:lineRule="auto"/>
             <w:ind w:left="360" w:firstLine="0"/>
@@ -3126,22 +2897,9 @@
               </w:rPr>
               <w:t xml:space="preserve">4.6 Matrizes de confusão e o erro de maior gravidade clínica</w:t>
               <w:tab/>
+              <w:t xml:space="preserve">11</w:t>
             </w:r>
           </w:hyperlink>
-          <w:r>
-            <w:fldChar w:fldCharType="begin"/>
-            <w:instrText xml:space="preserve"> PAGEREF _heading= \h </w:instrText>
-            <w:fldChar w:fldCharType="separate"/>
-          </w:r>
-          <w:r>
-            <w:rPr>
-              <w:rtl w:val="0"/>
-            </w:rPr>
-            <w:t xml:space="preserve">11</w:t>
-          </w:r>
-          <w:r>
-            <w:fldChar w:fldCharType="end"/>
-          </w:r>
           <w:r>
             <w:rPr>
               <w:rtl w:val="0"/>
@@ -3152,7 +2910,7 @@
           <w:pPr>
             <w:widowControl w:val="0"/>
             <w:tabs>
-              <w:tab w:val="right" w:leader="none" w:pos="9406"/>
+              <w:tab w:val="right" w:leader="dot" w:pos="12000"/>
             </w:tabs>
             <w:spacing w:before="60" w:line="240" w:lineRule="auto"/>
             <w:ind w:left="360" w:firstLine="0"/>
@@ -3170,22 +2928,9 @@
               </w:rPr>
               <w:t xml:space="preserve">4.7 Síntese das transformações e impacto nas métricas</w:t>
               <w:tab/>
+              <w:t xml:space="preserve">13</w:t>
             </w:r>
           </w:hyperlink>
-          <w:r>
-            <w:fldChar w:fldCharType="begin"/>
-            <w:instrText xml:space="preserve"> PAGEREF _heading= \h </w:instrText>
-            <w:fldChar w:fldCharType="separate"/>
-          </w:r>
-          <w:r>
-            <w:rPr>
-              <w:rtl w:val="0"/>
-            </w:rPr>
-            <w:t xml:space="preserve">13</w:t>
-          </w:r>
-          <w:r>
-            <w:fldChar w:fldCharType="end"/>
-          </w:r>
           <w:r>
             <w:rPr>
               <w:rtl w:val="0"/>
@@ -3196,7 +2941,7 @@
           <w:pPr>
             <w:widowControl w:val="0"/>
             <w:tabs>
-              <w:tab w:val="right" w:leader="none" w:pos="9406"/>
+              <w:tab w:val="right" w:leader="dot" w:pos="12000"/>
             </w:tabs>
             <w:spacing w:before="60" w:line="240" w:lineRule="auto"/>
             <w:rPr>
@@ -3217,24 +2962,9 @@
               </w:rPr>
               <w:t xml:space="preserve">5 MLflow: registro e tabulação dos experimentos</w:t>
               <w:tab/>
+              <w:t xml:space="preserve">13</w:t>
             </w:r>
           </w:hyperlink>
-          <w:r>
-            <w:fldChar w:fldCharType="begin"/>
-            <w:instrText xml:space="preserve"> PAGEREF _heading= \h </w:instrText>
-            <w:fldChar w:fldCharType="separate"/>
-          </w:r>
-          <w:r>
-            <w:rPr>
-              <w:b w:val="1"/>
-              <w:bCs w:val="1"/>
-              <w:rtl w:val="0"/>
-            </w:rPr>
-            <w:t xml:space="preserve">13</w:t>
-          </w:r>
-          <w:r>
-            <w:fldChar w:fldCharType="end"/>
-          </w:r>
           <w:r>
             <w:rPr>
               <w:rtl w:val="0"/>
@@ -3245,7 +2975,7 @@
           <w:pPr>
             <w:widowControl w:val="0"/>
             <w:tabs>
-              <w:tab w:val="right" w:leader="none" w:pos="9406"/>
+              <w:tab w:val="right" w:leader="dot" w:pos="12000"/>
             </w:tabs>
             <w:spacing w:before="60" w:line="240" w:lineRule="auto"/>
             <w:rPr>
@@ -3266,24 +2996,9 @@
               </w:rPr>
               <w:t xml:space="preserve">6 Avaliação comparativa entre execuções</w:t>
               <w:tab/>
+              <w:t xml:space="preserve">14</w:t>
             </w:r>
           </w:hyperlink>
-          <w:r>
-            <w:fldChar w:fldCharType="begin"/>
-            <w:instrText xml:space="preserve"> PAGEREF _heading= \h </w:instrText>
-            <w:fldChar w:fldCharType="separate"/>
-          </w:r>
-          <w:r>
-            <w:rPr>
-              <w:b w:val="1"/>
-              <w:bCs w:val="1"/>
-              <w:rtl w:val="0"/>
-            </w:rPr>
-            <w:t xml:space="preserve">14</w:t>
-          </w:r>
-          <w:r>
-            <w:fldChar w:fldCharType="end"/>
-          </w:r>
           <w:r>
             <w:rPr>
               <w:rtl w:val="0"/>
@@ -3294,7 +3009,7 @@
           <w:pPr>
             <w:widowControl w:val="0"/>
             <w:tabs>
-              <w:tab w:val="right" w:leader="none" w:pos="9406"/>
+              <w:tab w:val="right" w:leader="dot" w:pos="12000"/>
             </w:tabs>
             <w:spacing w:before="60" w:line="240" w:lineRule="auto"/>
             <w:rPr>
@@ -3315,24 +3030,9 @@
               </w:rPr>
               <w:t xml:space="preserve">7 Discussão e trabalhos relacionados</w:t>
               <w:tab/>
+              <w:t xml:space="preserve">15</w:t>
             </w:r>
           </w:hyperlink>
-          <w:r>
-            <w:fldChar w:fldCharType="begin"/>
-            <w:instrText xml:space="preserve"> PAGEREF _heading= \h </w:instrText>
-            <w:fldChar w:fldCharType="separate"/>
-          </w:r>
-          <w:r>
-            <w:rPr>
-              <w:b w:val="1"/>
-              <w:bCs w:val="1"/>
-              <w:rtl w:val="0"/>
-            </w:rPr>
-            <w:t xml:space="preserve">15</w:t>
-          </w:r>
-          <w:r>
-            <w:fldChar w:fldCharType="end"/>
-          </w:r>
           <w:r>
             <w:rPr>
               <w:rtl w:val="0"/>
@@ -3343,7 +3043,7 @@
           <w:pPr>
             <w:widowControl w:val="0"/>
             <w:tabs>
-              <w:tab w:val="right" w:leader="none" w:pos="9406"/>
+              <w:tab w:val="right" w:leader="dot" w:pos="12000"/>
             </w:tabs>
             <w:spacing w:before="60" w:line="240" w:lineRule="auto"/>
             <w:rPr>
@@ -3364,24 +3064,9 @@
               </w:rPr>
               <w:t xml:space="preserve">8 Conclusão e recomendações</w:t>
               <w:tab/>
+              <w:t xml:space="preserve">16</w:t>
             </w:r>
           </w:hyperlink>
-          <w:r>
-            <w:fldChar w:fldCharType="begin"/>
-            <w:instrText xml:space="preserve"> PAGEREF _heading= \h </w:instrText>
-            <w:fldChar w:fldCharType="separate"/>
-          </w:r>
-          <w:r>
-            <w:rPr>
-              <w:b w:val="1"/>
-              <w:bCs w:val="1"/>
-              <w:rtl w:val="0"/>
-            </w:rPr>
-            <w:t xml:space="preserve">16</w:t>
-          </w:r>
-          <w:r>
-            <w:fldChar w:fldCharType="end"/>
-          </w:r>
           <w:r>
             <w:rPr>
               <w:rtl w:val="0"/>
@@ -3392,7 +3077,7 @@
           <w:pPr>
             <w:widowControl w:val="0"/>
             <w:tabs>
-              <w:tab w:val="right" w:leader="none" w:pos="9406"/>
+              <w:tab w:val="right" w:leader="dot" w:pos="12000"/>
             </w:tabs>
             <w:spacing w:before="60" w:line="240" w:lineRule="auto"/>
             <w:rPr>
@@ -3413,24 +3098,9 @@
               </w:rPr>
               <w:t xml:space="preserve">Referências</w:t>
               <w:tab/>
+              <w:t xml:space="preserve">16</w:t>
             </w:r>
           </w:hyperlink>
-          <w:r>
-            <w:fldChar w:fldCharType="begin"/>
-            <w:instrText xml:space="preserve"> PAGEREF _heading= \h </w:instrText>
-            <w:fldChar w:fldCharType="separate"/>
-          </w:r>
-          <w:r>
-            <w:rPr>
-              <w:b w:val="1"/>
-              <w:bCs w:val="1"/>
-              <w:rtl w:val="0"/>
-            </w:rPr>
-            <w:t xml:space="preserve">16</w:t>
-          </w:r>
-          <w:r>
-            <w:fldChar w:fldCharType="end"/>
-          </w:r>
           <w:r>
             <w:rPr>
               <w:rtl w:val="0"/>
@@ -7937,7 +7607,7 @@
             </w:pPr>
             <w:sdt>
               <w:sdtPr>
-                <w:id w:val="2046578997"/>
+                <w:id w:val="1814126225"/>
                 <w:tag w:val="goog_rdk_0"/>
               </w:sdtPr>
               <w:sdtContent>
@@ -11107,7 +10777,7 @@
             </w:pPr>
             <w:sdt>
               <w:sdtPr>
-                <w:id w:val="-808102281"/>
+                <w:id w:val="-395478297"/>
                 <w:tag w:val="goog_rdk_1"/>
               </w:sdtPr>
               <w:sdtContent>
@@ -21324,12 +20994,12 @@
           <wp:inline distB="0" distT="0" distL="0" distR="0">
             <wp:extent cx="3200400" cy="2800350"/>
             <wp:effectExtent b="0" l="0" r="0" t="0"/>
-            <wp:docPr id="6" name="image3.png"/>
+            <wp:docPr id="6" name="image2.png"/>
             <a:graphic>
               <a:graphicData uri="http://schemas.openxmlformats.org/drawingml/2006/picture">
                 <pic:pic>
                   <pic:nvPicPr>
-                    <pic:cNvPr id="0" name="image3.png"/>
+                    <pic:cNvPr id="0" name="image2.png"/>
                     <pic:cNvPicPr preferRelativeResize="0"/>
                   </pic:nvPicPr>
                   <pic:blipFill>
@@ -21426,12 +21096,12 @@
           <wp:inline distB="0" distT="0" distL="0" distR="0">
             <wp:extent cx="3200400" cy="2800350"/>
             <wp:effectExtent b="0" l="0" r="0" t="0"/>
-            <wp:docPr id="5" name="image2.png"/>
+            <wp:docPr id="5" name="image3.png"/>
             <a:graphic>
               <a:graphicData uri="http://schemas.openxmlformats.org/drawingml/2006/picture">
                 <pic:pic>
                   <pic:nvPicPr>
-                    <pic:cNvPr id="0" name="image2.png"/>
+                    <pic:cNvPr id="0" name="image3.png"/>
                     <pic:cNvPicPr preferRelativeResize="0"/>
                   </pic:nvPicPr>
                   <pic:blipFill>
@@ -21864,7 +21534,7 @@
             </w:pPr>
             <w:sdt>
               <w:sdtPr>
-                <w:id w:val="921188152"/>
+                <w:id w:val="1046092446"/>
                 <w:tag w:val="goog_rdk_2"/>
               </w:sdtPr>
               <w:sdtContent>
@@ -22228,7 +21898,7 @@
             </w:pPr>
             <w:sdt>
               <w:sdtPr>
-                <w:id w:val="-1398201977"/>
+                <w:id w:val="330880199"/>
                 <w:tag w:val="goog_rdk_3"/>
               </w:sdtPr>
               <w:sdtContent>
@@ -22274,7 +21944,7 @@
             </w:pPr>
             <w:sdt>
               <w:sdtPr>
-                <w:id w:val="-541587882"/>
+                <w:id w:val="434763337"/>
                 <w:tag w:val="goog_rdk_4"/>
               </w:sdtPr>
               <w:sdtContent>
@@ -24374,7 +24044,7 @@
             </w:r>
             <w:sdt>
               <w:sdtPr>
-                <w:id w:val="-2107831952"/>
+                <w:id w:val="-232399436"/>
                 <w:tag w:val="goog_rdk_5"/>
               </w:sdtPr>
               <w:sdtContent>
@@ -26568,7 +26238,7 @@
             </w:pPr>
             <w:sdt>
               <w:sdtPr>
-                <w:id w:val="-1420093301"/>
+                <w:id w:val="862401425"/>
                 <w:tag w:val="goog_rdk_6"/>
               </w:sdtPr>
               <w:sdtContent>
@@ -27151,14 +26821,14 @@
         <w:rPr>
           <w:rtl w:val="0"/>
         </w:rPr>
-        <w:t xml:space="preserve">com maior segurança nos testes</w:t>
-      </w:r>
-      <w:r>
-        <w:rPr>
-          <w:rFonts w:ascii="Times New Roman" w:cs="Times New Roman" w:eastAsia="Times New Roman" w:hAnsi="Times New Roman"/>
-          <w:rtl w:val="0"/>
-        </w:rPr>
-        <w:t xml:space="preserve">, avaliar o ajuste do limiar de decisão e validar o modelo em base externa antes de qualquer uso real. Por fim, as 111 execuções registradas no MLflow permitem reproduzir e comparar todos os experimentos realizados.</w:t>
+        <w:t xml:space="preserve">com maior segurança nos testes. Deve-se</w:t>
+      </w:r>
+      <w:r>
+        <w:rPr>
+          <w:rFonts w:ascii="Times New Roman" w:cs="Times New Roman" w:eastAsia="Times New Roman" w:hAnsi="Times New Roman"/>
+          <w:rtl w:val="0"/>
+        </w:rPr>
+        <w:t xml:space="preserve"> avaliar o ajuste do limiar de decisão e validar o modelo em base externa antes de qualquer uso real. Por fim, as 111 execuções registradas no MLflow permitem reproduzir e comparar todos os experimentos realizados.</w:t>
       </w:r>
       <w:r>
         <w:rPr>

</xml_diff>